<commit_message>
Adição proposta de solução
</commit_message>
<xml_diff>
--- a/DOCUMENTAÇÃO - FISIO4LIFE(V1).docx
+++ b/DOCUMENTAÇÃO - FISIO4LIFE(V1).docx
@@ -72,7 +72,7 @@
     </w:p>
     <w:sdt>
       <w:sdtPr>
-        <w:id w:val="2108921234"/>
+        <w:id w:val="1775003079"/>
         <w:docPartObj>
           <w:docPartGallery w:val="Table of Contents"/>
           <w:docPartUnique/>
@@ -100,7 +100,7 @@
             <w:fldChar w:fldCharType="begin"/>
           </w:r>
           <w:r>
-            <w:instrText xml:space="preserve">HYPERLINK  \l  "_Toc1647691916" </w:instrText>
+            <w:instrText xml:space="preserve">HYPERLINK  \l  "_Toc420108591" </w:instrText>
           </w:r>
           <w:r>
             <w:fldChar w:fldCharType="separate"/>
@@ -116,7 +116,7 @@
             <w:fldChar w:fldCharType="begin"/>
           </w:r>
           <w:r>
-            <w:instrText xml:space="preserve">PAGEREF _Toc1647691916 \h</w:instrText>
+            <w:instrText xml:space="preserve">PAGEREF _Toc420108591 \h</w:instrText>
           </w:r>
           <w:r>
             <w:fldChar w:fldCharType="separate"/>
@@ -144,7 +144,7 @@
             <w:fldChar w:fldCharType="begin"/>
           </w:r>
           <w:r>
-            <w:instrText xml:space="preserve">HYPERLINK  \l  "_Toc890189365" </w:instrText>
+            <w:instrText xml:space="preserve">HYPERLINK  \l  "_Toc2069251990" </w:instrText>
           </w:r>
           <w:r>
             <w:fldChar w:fldCharType="separate"/>
@@ -160,7 +160,7 @@
             <w:fldChar w:fldCharType="begin"/>
           </w:r>
           <w:r>
-            <w:instrText xml:space="preserve">PAGEREF _Toc890189365 \h</w:instrText>
+            <w:instrText xml:space="preserve">PAGEREF _Toc2069251990 \h</w:instrText>
           </w:r>
           <w:r>
             <w:fldChar w:fldCharType="separate"/>
@@ -188,7 +188,7 @@
             <w:fldChar w:fldCharType="begin"/>
           </w:r>
           <w:r>
-            <w:instrText xml:space="preserve">HYPERLINK  \l  "_Toc375053507" </w:instrText>
+            <w:instrText xml:space="preserve">HYPERLINK  \l  "_Toc880640943" </w:instrText>
           </w:r>
           <w:r>
             <w:fldChar w:fldCharType="separate"/>
@@ -204,7 +204,7 @@
             <w:fldChar w:fldCharType="begin"/>
           </w:r>
           <w:r>
-            <w:instrText xml:space="preserve">PAGEREF _Toc375053507 \h</w:instrText>
+            <w:instrText xml:space="preserve">PAGEREF _Toc880640943 \h</w:instrText>
           </w:r>
           <w:r>
             <w:fldChar w:fldCharType="separate"/>
@@ -232,7 +232,7 @@
             <w:fldChar w:fldCharType="begin"/>
           </w:r>
           <w:r>
-            <w:instrText xml:space="preserve">HYPERLINK  \l  "_Toc332277534" </w:instrText>
+            <w:instrText xml:space="preserve">HYPERLINK  \l  "_Toc235524091" </w:instrText>
           </w:r>
           <w:r>
             <w:fldChar w:fldCharType="separate"/>
@@ -248,7 +248,7 @@
             <w:fldChar w:fldCharType="begin"/>
           </w:r>
           <w:r>
-            <w:instrText xml:space="preserve">PAGEREF _Toc332277534 \h</w:instrText>
+            <w:instrText xml:space="preserve">PAGEREF _Toc235524091 \h</w:instrText>
           </w:r>
           <w:r>
             <w:fldChar w:fldCharType="separate"/>
@@ -276,7 +276,7 @@
             <w:fldChar w:fldCharType="begin"/>
           </w:r>
           <w:r>
-            <w:instrText xml:space="preserve">HYPERLINK  \l  "_Toc384134269" </w:instrText>
+            <w:instrText xml:space="preserve">HYPERLINK  \l  "_Toc107641572" </w:instrText>
           </w:r>
           <w:r>
             <w:fldChar w:fldCharType="separate"/>
@@ -292,7 +292,51 @@
             <w:fldChar w:fldCharType="begin"/>
           </w:r>
           <w:r>
-            <w:instrText xml:space="preserve">PAGEREF _Toc384134269 \h</w:instrText>
+            <w:instrText xml:space="preserve">PAGEREF _Toc107641572 \h</w:instrText>
+          </w:r>
+          <w:r>
+            <w:fldChar w:fldCharType="separate"/>
+          </w:r>
+          <w:r>
+            <w:rPr/>
+            <w:t>3</w:t>
+          </w:r>
+          <w:r>
+            <w:fldChar w:fldCharType="end"/>
+          </w:r>
+          <w:r>
+            <w:fldChar w:fldCharType="end"/>
+          </w:r>
+        </w:p>
+        <w:p>
+          <w:pPr>
+            <w:pStyle w:val="TOC1"/>
+            <w:tabs>
+              <w:tab w:val="right" w:leader="dot" w:pos="9360"/>
+            </w:tabs>
+            <w:bidi w:val="0"/>
+          </w:pPr>
+          <w:r>
+            <w:fldChar w:fldCharType="begin"/>
+          </w:r>
+          <w:r>
+            <w:instrText xml:space="preserve">HYPERLINK  \l  "_Toc1570248736" </w:instrText>
+          </w:r>
+          <w:r>
+            <w:fldChar w:fldCharType="separate"/>
+          </w:r>
+          <w:r>
+            <w:rPr/>
+            <w:t>PROPOSTA DE SOLUÇÃO</w:t>
+          </w:r>
+          <w:r>
+            <w:tab/>
+          </w:r>
+          <w:r>
+            <w:fldChar w:fldCharType="begin"/>
+          </w:r>
+          <w:r>
+            <w:instrText xml:space="preserve">PAGEREF _Toc1570248736 \h</w:instrText>
           </w:r>
           <w:r>
             <w:fldChar w:fldCharType="separate"/>
@@ -300,6 +344,50 @@
           <w:r>
             <w:rPr/>
             <w:t>4</w:t>
+          </w:r>
+          <w:r>
+            <w:fldChar w:fldCharType="end"/>
+          </w:r>
+          <w:r>
+            <w:fldChar w:fldCharType="end"/>
+          </w:r>
+        </w:p>
+        <w:p>
+          <w:pPr>
+            <w:pStyle w:val="TOC1"/>
+            <w:tabs>
+              <w:tab w:val="right" w:leader="dot" w:pos="9360"/>
+            </w:tabs>
+            <w:bidi w:val="0"/>
+          </w:pPr>
+          <w:r>
+            <w:fldChar w:fldCharType="begin"/>
+          </w:r>
+          <w:r>
+            <w:instrText xml:space="preserve">HYPERLINK  \l  "_Toc1406115964" </w:instrText>
+          </w:r>
+          <w:r>
+            <w:fldChar w:fldCharType="separate"/>
+          </w:r>
+          <w:r>
+            <w:rPr/>
+            <w:t>FONTES</w:t>
+          </w:r>
+          <w:r>
+            <w:tab/>
+          </w:r>
+          <w:r>
+            <w:fldChar w:fldCharType="begin"/>
+          </w:r>
+          <w:r>
+            <w:instrText xml:space="preserve">PAGEREF _Toc1406115964 \h</w:instrText>
+          </w:r>
+          <w:r>
+            <w:fldChar w:fldCharType="separate"/>
+          </w:r>
+          <w:r>
+            <w:rPr/>
+            <w:t>5</w:t>
           </w:r>
           <w:r>
             <w:fldChar w:fldCharType="end"/>
@@ -355,14 +443,14 @@
           <w:color w:val="auto"/>
         </w:rPr>
       </w:pPr>
-      <w:bookmarkStart w:name="_Toc1647691916" w:id="1496279690"/>
+      <w:bookmarkStart w:name="_Toc420108591" w:id="2041269710"/>
       <w:r>
         <w:rPr>
           <w:color w:val="auto"/>
         </w:rPr>
         <w:t>PARTICIPANTES DO PROJETO</w:t>
       </w:r>
-      <w:bookmarkEnd w:id="1496279690"/>
+      <w:bookmarkEnd w:id="2041269710"/>
     </w:p>
     <w:p>
       <w:pPr>
@@ -870,14 +958,14 @@
           <w:color w:val="auto"/>
         </w:rPr>
       </w:pPr>
-      <w:bookmarkStart w:name="_Toc890189365" w:id="580055438"/>
+      <w:bookmarkStart w:name="_Toc2069251990" w:id="1756829685"/>
       <w:r>
         <w:rPr>
           <w:color w:val="auto"/>
         </w:rPr>
         <w:t>CONTEXTO</w:t>
       </w:r>
-      <w:bookmarkEnd w:id="580055438"/>
+      <w:bookmarkEnd w:id="1756829685"/>
     </w:p>
     <w:p>
       <w:pPr>
@@ -1455,7 +1543,7 @@
           <w:lang w:val="pt-BR"/>
         </w:rPr>
       </w:pPr>
-      <w:bookmarkStart w:name="_Toc375053507" w:id="144060475"/>
+      <w:bookmarkStart w:name="_Toc880640943" w:id="168494557"/>
       <w:r>
         <w:rPr>
           <w:color w:val="auto"/>
@@ -1463,7 +1551,7 @@
         </w:rPr>
         <w:t>FISIO4LIFE</w:t>
       </w:r>
-      <w:bookmarkEnd w:id="144060475"/>
+      <w:bookmarkEnd w:id="168494557"/>
     </w:p>
     <w:p>
       <w:pPr>
@@ -1563,7 +1651,7 @@
           <w:lang w:val="pt-BR"/>
         </w:rPr>
       </w:pPr>
-      <w:bookmarkStart w:name="_Toc332277534" w:id="633370711"/>
+      <w:bookmarkStart w:name="_Toc235524091" w:id="293766466"/>
       <w:r>
         <w:rPr>
           <w:color w:val="auto"/>
@@ -1571,7 +1659,7 @@
         </w:rPr>
         <w:t>JUSTIFICATIVA</w:t>
       </w:r>
-      <w:bookmarkEnd w:id="633370711"/>
+      <w:bookmarkEnd w:id="293766466"/>
       <w:r>
         <w:rPr>
           <w:color w:val="auto"/>
@@ -1627,7 +1715,7 @@
           <w:lang w:val="pt-BR"/>
         </w:rPr>
       </w:pPr>
-      <w:bookmarkStart w:name="_Toc384134269" w:id="1436880534"/>
+      <w:bookmarkStart w:name="_Toc107641572" w:id="366810374"/>
       <w:r>
         <w:rPr>
           <w:color w:val="auto"/>
@@ -1635,7 +1723,7 @@
         </w:rPr>
         <w:t>OBJETIVO</w:t>
       </w:r>
-      <w:bookmarkEnd w:id="1436880534"/>
+      <w:bookmarkEnd w:id="366810374"/>
     </w:p>
     <w:p>
       <w:pPr>
@@ -1779,45 +1867,144 @@
     </w:p>
     <w:p>
       <w:pPr>
-        <w:pStyle w:val="ListParagraph"/>
-        <w:ind w:left="720"/>
-        <w:rPr>
-          <w:b w:val="0"/>
-          <w:bCs w:val="0"/>
-          <w:lang w:val="pt-BR"/>
-        </w:rPr>
-      </w:pPr>
+        <w:pStyle w:val="Heading1"/>
+        <w:rPr>
+          <w:color w:val="auto"/>
+          <w:lang w:val="pt-BR"/>
+        </w:rPr>
+      </w:pPr>
+      <w:bookmarkStart w:name="_Toc1570248736" w:id="1097948599"/>
+      <w:r>
+        <w:rPr>
+          <w:color w:val="auto"/>
+          <w:lang w:val="pt-BR"/>
+        </w:rPr>
+        <w:t>PROPOSTA DE SOLUÇÃO</w:t>
+      </w:r>
+      <w:bookmarkEnd w:id="1097948599"/>
+      <w:r>
+        <w:rPr>
+          <w:color w:val="auto"/>
+          <w:lang w:val="pt-BR"/>
+        </w:rPr>
+        <w:t xml:space="preserve"> </w:t>
+      </w:r>
     </w:p>
     <w:p>
       <w:pPr>
         <w:pStyle w:val="Normal"/>
-        <w:rPr>
-          <w:b w:val="0"/>
-          <w:bCs w:val="0"/>
-          <w:lang w:val="pt-BR"/>
-        </w:rPr>
-      </w:pPr>
+        <w:ind w:left="0"/>
+      </w:pPr>
+      <w:r>
+        <w:rPr>
+          <w:b w:val="0"/>
+          <w:bCs w:val="0"/>
+          <w:lang w:val="pt-BR"/>
+        </w:rPr>
+        <w:t>Propõe-se o desenvolvimento de um sistema integrado para gerenciamento da clínica de fisioterapia, centralizando em uma única plataforma as principais informações e processos atualmente distribuídos em diferentes ferramentas.</w:t>
+      </w:r>
     </w:p>
     <w:p>
       <w:pPr>
         <w:pStyle w:val="Normal"/>
-        <w:rPr>
-          <w:b w:val="0"/>
-          <w:bCs w:val="0"/>
-          <w:lang w:val="pt-BR"/>
-        </w:rPr>
-      </w:pPr>
-    </w:p>
-    <w:p>
-      <w:pPr>
-        <w:pStyle w:val="Title"/>
-      </w:pPr>
-      <w:r>
-        <w:rPr>
+        <w:ind w:left="0"/>
+      </w:pPr>
+      <w:r>
+        <w:rPr>
+          <w:b w:val="0"/>
+          <w:bCs w:val="0"/>
+          <w:lang w:val="pt-BR"/>
+        </w:rPr>
+        <w:t>O sistema deverá permitir o gerenciamento de pacientes, fisioterapeutas e unidades, além do armazenamento centralizado de prontuários e registros de evolução. Dessa forma, profissionais autorizados poderão consultar o histórico do paciente, independentemente de qual fisioterapeuta realizou o atendimento anterior.</w:t>
+      </w:r>
+    </w:p>
+    <w:p>
+      <w:pPr>
+        <w:pStyle w:val="Normal"/>
+        <w:ind w:left="0"/>
+      </w:pPr>
+      <w:r>
+        <w:rPr>
+          <w:b w:val="0"/>
+          <w:bCs w:val="0"/>
+          <w:lang w:val="pt-BR"/>
+        </w:rPr>
+        <w:t>Também será disponibilizado um módulo de agendamento que permita visualizar os horários disponíveis, realizar agendamentos e controlar as confirmações de presença. O sistema deverá considerar a flexibilidade da agenda dos fisioterapeutas, permitindo que cada profissional defina seus horários e disponibilidade.</w:t>
+      </w:r>
+    </w:p>
+    <w:p>
+      <w:pPr>
+        <w:pStyle w:val="Normal"/>
+        <w:ind w:left="0"/>
+      </w:pPr>
+      <w:r>
+        <w:rPr>
+          <w:b w:val="0"/>
+          <w:bCs w:val="0"/>
+          <w:lang w:val="pt-BR"/>
+        </w:rPr>
+        <w:t>Para os pacientes, a solução deverá possibilitar o agendamento de avaliações e sessões, além da compra e acompanhamento de pacotes de sessões, indicando a quantidade utilizada e restante. O sistema também poderá auxiliar na geração e disponibilização das informações necessárias para solicitações de reembolso junto aos convênios</w:t>
+      </w:r>
+    </w:p>
+    <w:p>
+      <w:pPr>
+        <w:pStyle w:val="Normal"/>
+        <w:ind w:left="0"/>
+      </w:pPr>
+      <w:r>
+        <w:rPr>
+          <w:b w:val="0"/>
+          <w:bCs w:val="0"/>
+          <w:lang w:val="pt-BR"/>
+        </w:rPr>
+        <w:t>Na área administrativa, a solução deverá centralizar o registro de sessões e pagamentos, facilitando o acompanhamento financeiro da clínica e permitindo a geração de informações sobre o faturamento das duas unidades.</w:t>
+      </w:r>
+    </w:p>
+    <w:p>
+      <w:pPr>
+        <w:pStyle w:val="Normal"/>
+        <w:ind w:left="0"/>
+      </w:pPr>
+      <w:r>
+        <w:rPr>
+          <w:b w:val="0"/>
+          <w:bCs w:val="0"/>
+          <w:lang w:val="pt-BR"/>
+        </w:rPr>
+        <w:t>Por fim, a solução deverá auxiliar no primeiro contato com novos pacientes, utilizando recursos de automação para agilizar respostas e reduzir a possibilidade de perda de potenciais clientes por demora no atendimento.</w:t>
+      </w:r>
+    </w:p>
+    <w:p>
+      <w:pPr>
+        <w:pStyle w:val="Normal"/>
+        <w:ind w:left="0"/>
+      </w:pPr>
+      <w:r>
+        <w:rPr>
+          <w:b w:val="0"/>
+          <w:bCs w:val="0"/>
+          <w:lang w:val="pt-BR"/>
+        </w:rPr>
+        <w:t>Dessa maneira, a proposta busca substituir processos fragmentados e manuais por uma plataforma centralizada, proporcionando maior organização, eficiência e facilidade de acesso às informações, mantendo a autonomia dos fisioterapeutas e a flexibilidade necessária para o funcionamento da clínica.</w:t>
+      </w:r>
+    </w:p>
+    <w:p>
+      <w:pPr>
+        <w:pStyle w:val="Heading1"/>
+        <w:rPr>
+          <w:color w:val="auto"/>
+          <w:lang w:val="pt-BR"/>
+        </w:rPr>
+      </w:pPr>
+      <w:bookmarkStart w:name="_Toc1406115964" w:id="1039355589"/>
+      <w:r>
+        <w:rPr>
+          <w:color w:val="auto"/>
           <w:lang w:val="pt-BR"/>
         </w:rPr>
         <w:t>FONTES</w:t>
       </w:r>
+      <w:bookmarkEnd w:id="1039355589"/>
     </w:p>
     <w:p>
       <w:pPr>

</xml_diff>